<commit_message>
add lang versions && edit ru ver
</commit_message>
<xml_diff>
--- a/2026/03/docx/ru/CV_Ponomarov_Serhii_CNC.docx
+++ b/2026/03/docx/ru/CV_Ponomarov_Serhii_CNC.docx
@@ -131,21 +131,20 @@
           </w:p>
           <w:p>
             <w:pPr>
+              <w:pStyle w:val="Heading1"/>
               <w:spacing w:before="0" w:line="240" w:lineRule="auto"/>
               <w:rPr>
                 <w:rFonts w:ascii="Arial" w:cs="Arial" w:eastAsia="Arial" w:hAnsi="Arial"/>
-                <w:b w:val="1"/>
-                <w:bCs w:val="1"/>
                 <w:color w:val="b45f06"/>
                 <w:sz w:val="34"/>
                 <w:szCs w:val="34"/>
               </w:rPr>
             </w:pPr>
-            <w:r>
-              <w:rPr>
-                <w:rFonts w:ascii="Arial" w:cs="Arial" w:eastAsia="Arial" w:hAnsi="Arial"/>
-                <w:b w:val="1"/>
-                <w:bCs w:val="1"/>
+            <w:bookmarkStart w:colFirst="0" w:colLast="0" w:name="_mbdu2j1prbkb" w:id="0"/>
+            <w:bookmarkEnd w:id="0"/>
+            <w:r>
+              <w:rPr>
+                <w:rFonts w:ascii="Arial" w:cs="Arial" w:eastAsia="Arial" w:hAnsi="Arial"/>
                 <w:color w:val="b45f06"/>
                 <w:sz w:val="34"/>
                 <w:szCs w:val="34"/>
@@ -153,59 +152,47 @@
               </w:rPr>
               <w:t xml:space="preserve">ЧПУ Наладчик</w:t>
             </w:r>
-          </w:p>
-          <w:p>
-            <w:pPr>
-              <w:spacing w:before="0" w:line="240" w:lineRule="auto"/>
-              <w:rPr>
-                <w:rFonts w:ascii="Arial" w:cs="Arial" w:eastAsia="Arial" w:hAnsi="Arial"/>
-                <w:b w:val="1"/>
-                <w:bCs w:val="1"/>
+            <w:r>
+              <w:rPr>
+                <w:rFonts w:ascii="Arial" w:cs="Arial" w:eastAsia="Arial" w:hAnsi="Arial"/>
+                <w:b w:val="0"/>
+                <w:bCs w:val="0"/>
+                <w:sz w:val="20"/>
+                <w:szCs w:val="20"/>
+                <w:rtl w:val="0"/>
+              </w:rPr>
+              <w:br w:type="textWrapping"/>
+            </w:r>
+            <w:r>
+              <w:rPr>
+                <w:rFonts w:ascii="Arial" w:cs="Arial" w:eastAsia="Arial" w:hAnsi="Arial"/>
                 <w:color w:val="b45f06"/>
                 <w:sz w:val="34"/>
                 <w:szCs w:val="34"/>
-              </w:rPr>
-            </w:pPr>
-            <w:r>
-              <w:rPr>
-                <w:rFonts w:ascii="Arial" w:cs="Arial" w:eastAsia="Arial" w:hAnsi="Arial"/>
-                <w:b w:val="1"/>
-                <w:bCs w:val="1"/>
+                <w:rtl w:val="0"/>
+              </w:rPr>
+              <w:t xml:space="preserve">ЧПУ Оператор</w:t>
+            </w:r>
+            <w:r>
+              <w:rPr>
+                <w:rFonts w:ascii="Arial" w:cs="Arial" w:eastAsia="Arial" w:hAnsi="Arial"/>
+                <w:b w:val="0"/>
+                <w:bCs w:val="0"/>
+                <w:sz w:val="20"/>
+                <w:szCs w:val="20"/>
+                <w:rtl w:val="0"/>
+              </w:rPr>
+              <w:br w:type="textWrapping"/>
+            </w:r>
+            <w:r>
+              <w:rPr>
+                <w:rFonts w:ascii="Arial" w:cs="Arial" w:eastAsia="Arial" w:hAnsi="Arial"/>
                 <w:color w:val="b45f06"/>
                 <w:sz w:val="34"/>
                 <w:szCs w:val="34"/>
                 <w:rtl w:val="0"/>
               </w:rPr>
-              <w:t xml:space="preserve">ЧПУ Оператор</w:t>
-            </w:r>
-          </w:p>
-          <w:p>
-            <w:pPr>
-              <w:spacing w:before="0" w:line="240" w:lineRule="auto"/>
-              <w:rPr>
-                <w:rFonts w:ascii="Arial" w:cs="Arial" w:eastAsia="Arial" w:hAnsi="Arial"/>
-                <w:b w:val="1"/>
-                <w:bCs w:val="1"/>
-                <w:sz w:val="28"/>
-                <w:szCs w:val="28"/>
-              </w:rPr>
-            </w:pPr>
-            <w:r>
-              <w:rPr>
-                <w:rFonts w:ascii="Arial" w:cs="Arial" w:eastAsia="Arial" w:hAnsi="Arial"/>
-                <w:b w:val="1"/>
-                <w:bCs w:val="1"/>
-                <w:color w:val="b45f06"/>
-                <w:sz w:val="34"/>
-                <w:szCs w:val="34"/>
-                <w:rtl w:val="0"/>
-              </w:rPr>
               <w:t xml:space="preserve">ЧПУ Програмист</w:t>
-            </w:r>
-            <w:r>
-              <w:rPr>
-                <w:rtl w:val="0"/>
-              </w:rPr>
             </w:r>
           </w:p>
           <w:p>
@@ -257,10 +244,14 @@
               <w:spacing w:before="0" w:line="240" w:lineRule="auto"/>
               <w:rPr>
                 <w:rFonts w:ascii="Arial" w:cs="Arial" w:eastAsia="Arial" w:hAnsi="Arial"/>
-              </w:rPr>
-            </w:pPr>
-            <w:bookmarkStart w:colFirst="0" w:colLast="0" w:name="_83j40t9fkwr2" w:id="0"/>
-            <w:bookmarkEnd w:id="0"/>
+                <w:b w:val="0"/>
+                <w:bCs w:val="0"/>
+                <w:sz w:val="20"/>
+                <w:szCs w:val="20"/>
+              </w:rPr>
+            </w:pPr>
+            <w:bookmarkStart w:colFirst="0" w:colLast="0" w:name="_83j40t9fkwr2" w:id="1"/>
+            <w:bookmarkEnd w:id="1"/>
             <w:r>
               <w:rPr>
                 <w:rFonts w:ascii="Arial" w:cs="Arial" w:eastAsia="Arial" w:hAnsi="Arial"/>
@@ -268,39 +259,26 @@
               </w:rPr>
               <w:t xml:space="preserve">Образование:</w:t>
             </w:r>
-          </w:p>
-          <w:p>
-            <w:pPr>
-              <w:spacing w:before="0" w:line="240" w:lineRule="auto"/>
-              <w:rPr>
-                <w:rFonts w:ascii="Arial" w:cs="Arial" w:eastAsia="Arial" w:hAnsi="Arial"/>
-              </w:rPr>
-            </w:pPr>
-            <w:r>
-              <w:rPr>
-                <w:rFonts w:ascii="Arial" w:cs="Arial" w:eastAsia="Arial" w:hAnsi="Arial"/>
-                <w:rtl w:val="0"/>
-              </w:rPr>
+            <w:r>
+              <w:rPr>
+                <w:rFonts w:ascii="Arial" w:cs="Arial" w:eastAsia="Arial" w:hAnsi="Arial"/>
+                <w:b w:val="0"/>
+                <w:bCs w:val="0"/>
+                <w:sz w:val="20"/>
+                <w:szCs w:val="20"/>
+                <w:rtl w:val="0"/>
+              </w:rPr>
+              <w:br w:type="textWrapping"/>
               <w:t xml:space="preserve">Харьковский национальный университет радиоэлектроники (ХНУРЭ)</w:t>
-            </w:r>
-          </w:p>
-          <w:p>
-            <w:pPr>
-              <w:spacing w:before="0" w:line="240" w:lineRule="auto"/>
-              <w:rPr>
-                <w:rFonts w:ascii="Arial" w:cs="Arial" w:eastAsia="Arial" w:hAnsi="Arial"/>
-              </w:rPr>
-            </w:pPr>
-            <w:r>
-              <w:rPr>
-                <w:rFonts w:ascii="Arial" w:cs="Arial" w:eastAsia="Arial" w:hAnsi="Arial"/>
-                <w:rtl w:val="0"/>
-              </w:rPr>
+              <w:br w:type="textWrapping"/>
               <w:t xml:space="preserve">Бакалавр радиотехники</w:t>
-            </w:r>
-          </w:p>
-          <w:p>
-            <w:pPr>
+              <w:br w:type="textWrapping"/>
+              <w:t xml:space="preserve">Харьков, Украина</w:t>
+            </w:r>
+          </w:p>
+          <w:p>
+            <w:pPr>
+              <w:widowControl w:val="0"/>
               <w:spacing w:before="0" w:line="240" w:lineRule="auto"/>
               <w:rPr>
                 <w:rFonts w:ascii="Arial" w:cs="Arial" w:eastAsia="Arial" w:hAnsi="Arial"/>
@@ -310,13 +288,6 @@
                 <w:szCs w:val="28"/>
               </w:rPr>
             </w:pPr>
-            <w:r>
-              <w:rPr>
-                <w:rFonts w:ascii="Arial" w:cs="Arial" w:eastAsia="Arial" w:hAnsi="Arial"/>
-                <w:rtl w:val="0"/>
-              </w:rPr>
-              <w:t xml:space="preserve">Харьков, Украина</w:t>
-            </w:r>
             <w:r>
               <w:rPr>
                 <w:rtl w:val="0"/>
@@ -353,10 +324,14 @@
               <w:spacing w:before="0" w:line="240" w:lineRule="auto"/>
               <w:rPr>
                 <w:rFonts w:ascii="Arial" w:cs="Arial" w:eastAsia="Arial" w:hAnsi="Arial"/>
-              </w:rPr>
-            </w:pPr>
-            <w:bookmarkStart w:colFirst="0" w:colLast="0" w:name="_swdn9d6x90nz" w:id="1"/>
-            <w:bookmarkEnd w:id="1"/>
+                <w:b w:val="0"/>
+                <w:bCs w:val="0"/>
+                <w:sz w:val="20"/>
+                <w:szCs w:val="20"/>
+              </w:rPr>
+            </w:pPr>
+            <w:bookmarkStart w:colFirst="0" w:colLast="0" w:name="_swdn9d6x90nz" w:id="2"/>
+            <w:bookmarkEnd w:id="2"/>
             <w:r>
               <w:rPr>
                 <w:rFonts w:ascii="Arial" w:cs="Arial" w:eastAsia="Arial" w:hAnsi="Arial"/>
@@ -364,24 +339,24 @@
               </w:rPr>
               <w:t xml:space="preserve">Локация:</w:t>
             </w:r>
-          </w:p>
-          <w:p>
-            <w:pPr>
-              <w:spacing w:before="0" w:line="240" w:lineRule="auto"/>
-              <w:rPr>
-                <w:rFonts w:ascii="Arial" w:cs="Arial" w:eastAsia="Arial" w:hAnsi="Arial"/>
-              </w:rPr>
-            </w:pPr>
-            <w:r>
-              <w:rPr>
-                <w:rFonts w:ascii="Arial" w:cs="Arial" w:eastAsia="Arial" w:hAnsi="Arial"/>
-                <w:rtl w:val="0"/>
-              </w:rPr>
+            <w:r>
+              <w:rPr>
+                <w:rFonts w:ascii="Arial" w:cs="Arial" w:eastAsia="Arial" w:hAnsi="Arial"/>
+                <w:b w:val="0"/>
+                <w:bCs w:val="0"/>
+                <w:sz w:val="20"/>
+                <w:szCs w:val="20"/>
+                <w:rtl w:val="0"/>
+              </w:rPr>
+              <w:br w:type="textWrapping"/>
               <w:t xml:space="preserve">Брно, Чехия |</w:t>
-            </w:r>
-          </w:p>
-          <w:p>
-            <w:pPr>
+              <w:br w:type="textWrapping"/>
+              <w:t xml:space="preserve">Готов к релокации по Чехии </w:t>
+            </w:r>
+          </w:p>
+          <w:p>
+            <w:pPr>
+              <w:widowControl w:val="0"/>
               <w:spacing w:before="0" w:line="240" w:lineRule="auto"/>
               <w:rPr>
                 <w:rFonts w:ascii="Arial" w:cs="Arial" w:eastAsia="Arial" w:hAnsi="Arial"/>
@@ -391,13 +366,6 @@
                 <w:szCs w:val="28"/>
               </w:rPr>
             </w:pPr>
-            <w:r>
-              <w:rPr>
-                <w:rFonts w:ascii="Arial" w:cs="Arial" w:eastAsia="Arial" w:hAnsi="Arial"/>
-                <w:rtl w:val="0"/>
-              </w:rPr>
-              <w:t xml:space="preserve">Готов к релокации по Чехии </w:t>
-            </w:r>
             <w:r>
               <w:rPr>
                 <w:rtl w:val="0"/>
@@ -439,10 +407,14 @@
               <w:spacing w:before="0" w:line="240" w:lineRule="auto"/>
               <w:rPr>
                 <w:rFonts w:ascii="Arial" w:cs="Arial" w:eastAsia="Arial" w:hAnsi="Arial"/>
-              </w:rPr>
-            </w:pPr>
-            <w:bookmarkStart w:colFirst="0" w:colLast="0" w:name="_5qq5jojv3dzw" w:id="2"/>
-            <w:bookmarkEnd w:id="2"/>
+                <w:b w:val="0"/>
+                <w:bCs w:val="0"/>
+                <w:sz w:val="20"/>
+                <w:szCs w:val="20"/>
+              </w:rPr>
+            </w:pPr>
+            <w:bookmarkStart w:colFirst="0" w:colLast="0" w:name="_5qq5jojv3dzw" w:id="3"/>
+            <w:bookmarkEnd w:id="3"/>
             <w:r>
               <w:rPr>
                 <w:rFonts w:ascii="Arial" w:cs="Arial" w:eastAsia="Arial" w:hAnsi="Arial"/>
@@ -450,74 +422,23 @@
               </w:rPr>
               <w:t xml:space="preserve">Языки:</w:t>
             </w:r>
-          </w:p>
-          <w:p>
-            <w:pPr>
-              <w:spacing w:before="0" w:line="240" w:lineRule="auto"/>
-              <w:rPr>
-                <w:rFonts w:ascii="Arial" w:cs="Arial" w:eastAsia="Arial" w:hAnsi="Arial"/>
-              </w:rPr>
-            </w:pPr>
-            <w:r>
-              <w:rPr>
-                <w:rFonts w:ascii="Arial" w:cs="Arial" w:eastAsia="Arial" w:hAnsi="Arial"/>
-                <w:rtl w:val="0"/>
-              </w:rPr>
+            <w:r>
+              <w:rPr>
+                <w:rFonts w:ascii="Arial" w:cs="Arial" w:eastAsia="Arial" w:hAnsi="Arial"/>
+                <w:b w:val="0"/>
+                <w:bCs w:val="0"/>
+                <w:sz w:val="20"/>
+                <w:szCs w:val="20"/>
+                <w:rtl w:val="0"/>
+              </w:rPr>
+              <w:br w:type="textWrapping"/>
               <w:t xml:space="preserve">Английский — B1</w:t>
-            </w:r>
-          </w:p>
-          <w:p>
-            <w:pPr>
-              <w:spacing w:before="0" w:line="240" w:lineRule="auto"/>
-              <w:rPr>
-                <w:rFonts w:ascii="Arial" w:cs="Arial" w:eastAsia="Arial" w:hAnsi="Arial"/>
-              </w:rPr>
-            </w:pPr>
-            <w:r>
-              <w:rPr>
-                <w:rFonts w:ascii="Arial" w:cs="Arial" w:eastAsia="Arial" w:hAnsi="Arial"/>
-                <w:rtl w:val="0"/>
-              </w:rPr>
+              <w:br w:type="textWrapping"/>
               <w:t xml:space="preserve">Чешский — B2</w:t>
-            </w:r>
-          </w:p>
-          <w:p>
-            <w:pPr>
-              <w:spacing w:before="0" w:line="240" w:lineRule="auto"/>
-              <w:rPr>
-                <w:rFonts w:ascii="Arial" w:cs="Arial" w:eastAsia="Arial" w:hAnsi="Arial"/>
-              </w:rPr>
-            </w:pPr>
-            <w:r>
-              <w:rPr>
-                <w:rFonts w:ascii="Arial" w:cs="Arial" w:eastAsia="Arial" w:hAnsi="Arial"/>
-                <w:rtl w:val="0"/>
-              </w:rPr>
+              <w:br w:type="textWrapping"/>
               <w:t xml:space="preserve">Русский — родной</w:t>
-            </w:r>
-          </w:p>
-          <w:p>
-            <w:pPr>
-              <w:spacing w:before="0" w:line="240" w:lineRule="auto"/>
-              <w:rPr>
-                <w:rFonts w:ascii="Arial" w:cs="Arial" w:eastAsia="Arial" w:hAnsi="Arial"/>
-                <w:b w:val="1"/>
-                <w:bCs w:val="1"/>
-                <w:sz w:val="24"/>
-                <w:szCs w:val="24"/>
-              </w:rPr>
-            </w:pPr>
-            <w:r>
-              <w:rPr>
-                <w:rFonts w:ascii="Arial" w:cs="Arial" w:eastAsia="Arial" w:hAnsi="Arial"/>
-                <w:rtl w:val="0"/>
-              </w:rPr>
+              <w:br w:type="textWrapping"/>
               <w:t xml:space="preserve">Украинский — родной</w:t>
-            </w:r>
-            <w:r>
-              <w:rPr>
-                <w:rtl w:val="0"/>
-              </w:rPr>
             </w:r>
           </w:p>
           <w:p>
@@ -570,10 +491,12 @@
               <w:widowControl w:val="0"/>
               <w:spacing w:before="0" w:lineRule="auto"/>
               <w:jc w:val="center"/>
-              <w:rPr/>
-            </w:pPr>
-            <w:bookmarkStart w:colFirst="0" w:colLast="0" w:name="_ysczocrn4uuz" w:id="3"/>
-            <w:bookmarkEnd w:id="3"/>
+              <w:rPr>
+                <w:rFonts w:ascii="Arial" w:cs="Arial" w:eastAsia="Arial" w:hAnsi="Arial"/>
+              </w:rPr>
+            </w:pPr>
+            <w:bookmarkStart w:colFirst="0" w:colLast="0" w:name="_ysczocrn4uuz" w:id="4"/>
+            <w:bookmarkEnd w:id="4"/>
             <w:r>
               <w:rPr>
                 <w:rFonts w:ascii="Arial" w:cs="Arial" w:eastAsia="Arial" w:hAnsi="Arial"/>
@@ -591,7 +514,9 @@
             <w:pPr>
               <w:widowControl w:val="0"/>
               <w:spacing w:before="0" w:line="240" w:lineRule="auto"/>
-              <w:rPr/>
+              <w:rPr>
+                <w:rFonts w:ascii="Arial" w:cs="Arial" w:eastAsia="Arial" w:hAnsi="Arial"/>
+              </w:rPr>
             </w:pPr>
             <w:r>
               <w:rPr>
@@ -709,16 +634,16 @@
               <w:widowControl w:val="0"/>
               <w:spacing w:before="0" w:lineRule="auto"/>
               <w:rPr>
-                <w:b w:val="1"/>
-                <w:bCs w:val="1"/>
+                <w:rFonts w:ascii="Arial" w:cs="Arial" w:eastAsia="Arial" w:hAnsi="Arial"/>
                 <w:sz w:val="28"/>
                 <w:szCs w:val="28"/>
               </w:rPr>
             </w:pPr>
-            <w:bookmarkStart w:colFirst="0" w:colLast="0" w:name="_1btop1n1mouc" w:id="4"/>
-            <w:bookmarkEnd w:id="4"/>
-            <w:r>
-              <w:rPr>
+            <w:bookmarkStart w:colFirst="0" w:colLast="0" w:name="_1btop1n1mouc" w:id="5"/>
+            <w:bookmarkEnd w:id="5"/>
+            <w:r>
+              <w:rPr>
+                <w:rFonts w:ascii="Arial" w:cs="Arial" w:eastAsia="Arial" w:hAnsi="Arial"/>
                 <w:sz w:val="20"/>
                 <w:szCs w:val="20"/>
               </w:rPr>
@@ -757,8 +682,7 @@
             </w:r>
             <w:r>
               <w:rPr>
-                <w:b w:val="1"/>
-                <w:bCs w:val="1"/>
+                <w:rFonts w:ascii="Arial" w:cs="Arial" w:eastAsia="Arial" w:hAnsi="Arial"/>
                 <w:sz w:val="28"/>
                 <w:szCs w:val="28"/>
                 <w:rtl w:val="0"/>
@@ -1008,8 +932,8 @@
           <w:szCs w:val="16"/>
         </w:rPr>
       </w:pPr>
-      <w:bookmarkStart w:colFirst="0" w:colLast="0" w:name="_w63pb9kl6pf" w:id="5"/>
-      <w:bookmarkEnd w:id="5"/>
+      <w:bookmarkStart w:colFirst="0" w:colLast="0" w:name="_w63pb9kl6pf" w:id="6"/>
+      <w:bookmarkEnd w:id="6"/>
       <w:r>
         <w:pict>
           <v:rect style="width:0.0pt;height:1.5pt" o:hr="t" o:hrstd="t" o:hralign="center" fillcolor="#A0A0A0" stroked="f"/>
@@ -1032,8 +956,8 @@
           <w:rFonts w:ascii="Arial" w:cs="Arial" w:eastAsia="Arial" w:hAnsi="Arial"/>
         </w:rPr>
       </w:pPr>
-      <w:bookmarkStart w:colFirst="0" w:colLast="0" w:name="_aw5apt3qrwb8" w:id="6"/>
-      <w:bookmarkEnd w:id="6"/>
+      <w:bookmarkStart w:colFirst="0" w:colLast="0" w:name="_aw5apt3qrwb8" w:id="7"/>
+      <w:bookmarkEnd w:id="7"/>
       <w:r>
         <w:rPr>
           <w:rFonts w:ascii="Arial" w:cs="Arial" w:eastAsia="Arial" w:hAnsi="Arial"/>

</xml_diff>